<commit_message>
Migra Actividad 3.2 a Escaparate con RDS real, DynamoDB como reto y DocumentDB en razonamiento
Integra la app real Escaparate en las actividades 3.2/3.3/4.x/5.x/6.2/6.3/7.1 tras
clonar y analizar el repo real; reescribe 3.2 de cero con RDS Multi-AZ, backups,
snapshots y réplica de lectura validados en vivo contra el Learner Lab. Revierte
DocumentDB a solo razonamiento al confirmar que el laboratorio bloquea por IAM la
creación de su instancia, dejando DynamoDB como único reto NoSQL desplegado de verdad.
</commit_message>
<xml_diff>
--- a/docs/tema3/plantillas/Actividad_3_2_INU_Plantilla.docx
+++ b/docs/tema3/plantillas/Actividad_3_2_INU_Plantilla.docx
@@ -167,7 +167,7 @@
                 <w:sz w:val="20"/>
                 <w:szCs w:val="20"/>
               </w:rPr>
-              <w:t xml:space="preserve">Identificador de recursos usado (ej. biblioteca-db-&lt;tu-identificador&gt;): _______________________</w:t>
+              <w:t xml:space="preserve">Identificador de recursos usado (ej. escaparate-db-&lt;tu-identificador&gt;): _______________________</w:t>
             </w:r>
           </w:p>
         </w:tc>
@@ -198,7 +198,7 @@
           <w:sz w:val="26"/>
           <w:szCs w:val="26"/>
         </w:rPr>
-        <w:t xml:space="preserve">Parte A — RDS sin credenciales en el código</w:t>
+        <w:t xml:space="preserve">Parte A — Migra, prueba y amplía la base de datos</w:t>
       </w:r>
     </w:p>
     <w:p>
@@ -222,7 +222,7 @@
           <w:sz w:val="24"/>
           <w:szCs w:val="24"/>
         </w:rPr>
-        <w:t xml:space="preserve">Paso 1 — Crea la base de datos desde la consola</w:t>
+        <w:t xml:space="preserve">Paso 2 — Crea la base de datos RDS</w:t>
       </w:r>
     </w:p>
     <w:tbl>
@@ -268,7 +268,7 @@
                 <w:sz w:val="20"/>
                 <w:szCs w:val="20"/>
               </w:rPr>
-              <w:t xml:space="preserve">📸 Instancia RDS en estado available, con su endpoint visible</w:t>
+              <w:t xml:space="preserve">📸 Pestaña Configuración: motor y clase de instancia visibles</w:t>
             </w:r>
           </w:p>
         </w:tc>
@@ -361,7 +361,7 @@
                 <w:sz w:val="20"/>
                 <w:szCs w:val="20"/>
               </w:rPr>
-              <w:t xml:space="preserve">📸 Secreto de la base de datos listado en Secrets Manager, sin mostrar su valor</w:t>
+              <w:t xml:space="preserve">📸 Página del grupo de subredes (RDS → Grupos de subredes), con la VPC y las subredes que contiene</w:t>
             </w:r>
           </w:p>
         </w:tc>
@@ -410,11 +410,6 @@
       <w:pPr>
         <w:spacing w:after="200"/>
       </w:pPr>
-    </w:p>
-    <w:p>
-      <w:r>
-        <w:br w:type="page"/>
-      </w:r>
     </w:p>
     <w:p>
       <w:pPr>
@@ -432,7 +427,7 @@
           <w:sz w:val="24"/>
           <w:szCs w:val="24"/>
         </w:rPr>
-        <w:t xml:space="preserve">Paso 2 — Conecta la aplicación resolviendo el secreto en tiempo de ejecución</w:t>
+        <w:t xml:space="preserve">Paso 3 — Lanza la instancia de Escaparate</w:t>
       </w:r>
     </w:p>
     <w:tbl>
@@ -478,7 +473,7 @@
                 <w:sz w:val="20"/>
                 <w:szCs w:val="20"/>
               </w:rPr>
-              <w:t xml:space="preserve">📸 La aplicación mostrando el catálogo de libros con datos reales servidos desde RDS</w:t>
+              <w:t xml:space="preserve">📸 Salida de java -version y listado de los ficheros subidos</w:t>
             </w:r>
           </w:p>
         </w:tc>
@@ -525,8 +520,27 @@
     </w:tbl>
     <w:p>
       <w:pPr>
-        <w:spacing w:after="120"/>
-      </w:pPr>
+        <w:spacing w:after="200"/>
+      </w:pPr>
+    </w:p>
+    <w:p>
+      <w:pPr>
+        <w:pBdr>
+          <w:bottom w:val="single" w:color="FFA000" w:sz="4" w:space="1"/>
+        </w:pBdr>
+        <w:spacing w:after="120" w:before="240"/>
+      </w:pPr>
+      <w:r>
+        <w:rPr>
+          <w:rFonts w:ascii="Arial" w:cs="Arial" w:eastAsia="Arial" w:hAnsi="Arial"/>
+          <w:b/>
+          <w:bCs/>
+          <w:color w:val="3949AB"/>
+          <w:sz w:val="24"/>
+          <w:szCs w:val="24"/>
+        </w:rPr>
+        <w:t xml:space="preserve">Paso 4 — Corrige el grupo de seguridad de RDS</w:t>
+      </w:r>
     </w:p>
     <w:tbl>
       <w:tblPr>
@@ -571,7 +585,7 @@
                 <w:sz w:val="20"/>
                 <w:szCs w:val="20"/>
               </w:rPr>
-              <w:t xml:space="preserve">📸 Grep sobre el repositorio que no encuentra ninguna credencial en texto plano</w:t>
+              <w:t xml:space="preserve">📸 Regla de entrada del grupo de seguridad de RDS, mostrando el grupo de seguridad de origen</w:t>
             </w:r>
           </w:p>
         </w:tc>
@@ -620,6 +634,11 @@
       <w:pPr>
         <w:spacing w:after="200"/>
       </w:pPr>
+    </w:p>
+    <w:p>
+      <w:r>
+        <w:br w:type="page"/>
+      </w:r>
     </w:p>
     <w:p>
       <w:pPr>
@@ -637,21 +656,7 @@
           <w:sz w:val="24"/>
           <w:szCs w:val="24"/>
         </w:rPr>
-        <w:t xml:space="preserve">Reflexiona</w:t>
-      </w:r>
-    </w:p>
-    <w:p>
-      <w:pPr>
-        <w:spacing w:after="100"/>
-      </w:pPr>
-      <w:r>
-        <w:rPr>
-          <w:rFonts w:ascii="Arial" w:cs="Arial" w:eastAsia="Arial" w:hAnsi="Arial"/>
-          <w:color w:val="212121"/>
-          <w:sz w:val="22"/>
-          <w:szCs w:val="22"/>
-        </w:rPr>
-        <w:t xml:space="preserve">Si mañana cambia la contraseña de la base de datos (por ejemplo, por rotación automática), ¿qué parte de tu configuración tendrías que tocar para que la aplicación siga funcionando? Compáralo con lo que habría pasado si la contraseña estuviera escrita directamente en el código.</w:t>
+        <w:t xml:space="preserve">Paso 5 — Carga el esquema y arranca Escaparate</w:t>
       </w:r>
     </w:p>
     <w:tbl>
@@ -670,8 +675,41 @@
         <w:gridCol w:w="9638"/>
       </w:tblGrid>
       <w:tr>
+        <w:tc>
+          <w:tcPr>
+            <w:tcW w:type="dxa" w:w="9638"/>
+            <w:tcBorders>
+              <w:top w:val="none" w:color="FFFFFF" w:sz="0"/>
+              <w:left w:val="none" w:color="FFFFFF" w:sz="0"/>
+              <w:bottom w:val="none" w:color="FFFFFF" w:sz="0"/>
+              <w:right w:val="none" w:color="FFFFFF" w:sz="0"/>
+            </w:tcBorders>
+            <w:shd w:fill="3949AB" w:val="clear"/>
+            <w:tcMar>
+              <w:top w:type="dxa" w:w="80"/>
+              <w:left w:type="dxa" w:w="160"/>
+              <w:bottom w:type="dxa" w:w="80"/>
+              <w:right w:type="dxa" w:w="160"/>
+            </w:tcMar>
+          </w:tcPr>
+          <w:p>
+            <w:r>
+              <w:rPr>
+                <w:rFonts w:ascii="Arial" w:cs="Arial" w:eastAsia="Arial" w:hAnsi="Arial"/>
+                <w:b/>
+                <w:bCs/>
+                <w:color w:val="FFFFFF"/>
+                <w:sz w:val="20"/>
+                <w:szCs w:val="20"/>
+              </w:rPr>
+              <w:t xml:space="preserve">📸 Respuesta de /api/salud/listo, y el catálogo de Escaparate funcionando en el navegador</w:t>
+            </w:r>
+          </w:p>
+        </w:tc>
+      </w:tr>
+      <w:tr>
         <w:trPr>
-          <w:trHeight w:val="480"/>
+          <w:trHeight w:val="2400"/>
         </w:trPr>
         <w:tc>
           <w:tcPr>
@@ -684,115 +722,26 @@
             </w:tcBorders>
             <w:shd w:fill="FAFAFA" w:val="clear"/>
             <w:tcMar>
-              <w:top w:type="dxa" w:w="60"/>
-              <w:left w:type="dxa" w:w="160"/>
-              <w:bottom w:type="dxa" w:w="60"/>
-              <w:right w:type="dxa" w:w="160"/>
-            </w:tcMar>
-          </w:tcPr>
-          <w:p>
-            <w:r>
-              <w:rPr>
-                <w:sz w:val="22"/>
-                <w:szCs w:val="22"/>
-              </w:rPr>
-              <w:t xml:space="preserve"/>
-            </w:r>
-          </w:p>
-        </w:tc>
-      </w:tr>
-      <w:tr>
-        <w:trPr>
-          <w:trHeight w:val="480"/>
-        </w:trPr>
-        <w:tc>
-          <w:tcPr>
-            <w:tcW w:type="dxa" w:w="9638"/>
-            <w:tcBorders>
-              <w:top w:val="single" w:color="E0E0E0" w:sz="4"/>
-              <w:left w:val="single" w:color="E0E0E0" w:sz="4"/>
-              <w:bottom w:val="single" w:color="E0E0E0" w:sz="4"/>
-              <w:right w:val="single" w:color="E0E0E0" w:sz="4"/>
-            </w:tcBorders>
-            <w:shd w:fill="FAFAFA" w:val="clear"/>
-            <w:tcMar>
-              <w:top w:type="dxa" w:w="60"/>
-              <w:left w:type="dxa" w:w="160"/>
-              <w:bottom w:type="dxa" w:w="60"/>
-              <w:right w:type="dxa" w:w="160"/>
-            </w:tcMar>
-          </w:tcPr>
-          <w:p>
-            <w:r>
-              <w:rPr>
-                <w:sz w:val="22"/>
-                <w:szCs w:val="22"/>
-              </w:rPr>
-              <w:t xml:space="preserve"/>
-            </w:r>
-          </w:p>
-        </w:tc>
-      </w:tr>
-      <w:tr>
-        <w:trPr>
-          <w:trHeight w:val="480"/>
-        </w:trPr>
-        <w:tc>
-          <w:tcPr>
-            <w:tcW w:type="dxa" w:w="9638"/>
-            <w:tcBorders>
-              <w:top w:val="single" w:color="E0E0E0" w:sz="4"/>
-              <w:left w:val="single" w:color="E0E0E0" w:sz="4"/>
-              <w:bottom w:val="single" w:color="E0E0E0" w:sz="4"/>
-              <w:right w:val="single" w:color="E0E0E0" w:sz="4"/>
-            </w:tcBorders>
-            <w:shd w:fill="FAFAFA" w:val="clear"/>
-            <w:tcMar>
-              <w:top w:type="dxa" w:w="60"/>
-              <w:left w:type="dxa" w:w="160"/>
-              <w:bottom w:type="dxa" w:w="60"/>
-              <w:right w:type="dxa" w:w="160"/>
-            </w:tcMar>
-          </w:tcPr>
-          <w:p>
-            <w:r>
-              <w:rPr>
-                <w:sz w:val="22"/>
-                <w:szCs w:val="22"/>
-              </w:rPr>
-              <w:t xml:space="preserve"/>
-            </w:r>
-          </w:p>
-        </w:tc>
-      </w:tr>
-      <w:tr>
-        <w:trPr>
-          <w:trHeight w:val="480"/>
-        </w:trPr>
-        <w:tc>
-          <w:tcPr>
-            <w:tcW w:type="dxa" w:w="9638"/>
-            <w:tcBorders>
-              <w:top w:val="single" w:color="E0E0E0" w:sz="4"/>
-              <w:left w:val="single" w:color="E0E0E0" w:sz="4"/>
-              <w:bottom w:val="single" w:color="E0E0E0" w:sz="4"/>
-              <w:right w:val="single" w:color="E0E0E0" w:sz="4"/>
-            </w:tcBorders>
-            <w:shd w:fill="FAFAFA" w:val="clear"/>
-            <w:tcMar>
-              <w:top w:type="dxa" w:w="60"/>
-              <w:left w:type="dxa" w:w="160"/>
-              <w:bottom w:type="dxa" w:w="60"/>
-              <w:right w:type="dxa" w:w="160"/>
-            </w:tcMar>
-          </w:tcPr>
-          <w:p>
-            <w:r>
-              <w:rPr>
-                <w:sz w:val="22"/>
-                <w:szCs w:val="22"/>
-              </w:rPr>
-              <w:t xml:space="preserve"/>
+              <w:top w:type="dxa" w:w="80"/>
+              <w:left w:type="dxa" w:w="160"/>
+              <w:bottom w:type="dxa" w:w="80"/>
+              <w:right w:type="dxa" w:w="160"/>
+            </w:tcMar>
+          </w:tcPr>
+          <w:p>
+            <w:pPr>
+              <w:jc w:val="center"/>
+            </w:pPr>
+            <w:r>
+              <w:rPr>
+                <w:rFonts w:ascii="Arial" w:cs="Arial" w:eastAsia="Arial" w:hAnsi="Arial"/>
+                <w:i/>
+                <w:iCs/>
+                <w:color w:val="757575"/>
+                <w:sz w:val="20"/>
+                <w:szCs w:val="20"/>
+              </w:rPr>
+              <w:t xml:space="preserve">[Pega aquí la captura de pantalla]</w:t>
             </w:r>
           </w:p>
         </w:tc>
@@ -801,34 +750,6 @@
     <w:p>
       <w:pPr>
         <w:spacing w:after="200"/>
-      </w:pPr>
-    </w:p>
-    <w:p>
-      <w:r>
-        <w:br w:type="page"/>
-      </w:r>
-    </w:p>
-    <w:p>
-      <w:pPr>
-        <w:shd w:fill="3949AB" w:val="clear"/>
-        <w:spacing w:after="0" w:before="320"/>
-        <w:ind w:left="200" w:right="200"/>
-      </w:pPr>
-      <w:r>
-        <w:rPr>
-          <w:rFonts w:ascii="Arial" w:cs="Arial" w:eastAsia="Arial" w:hAnsi="Arial"/>
-          <w:b/>
-          <w:bCs/>
-          <w:color w:val="FFFFFF"/>
-          <w:sz w:val="26"/>
-          <w:szCs w:val="26"/>
-        </w:rPr>
-        <w:t xml:space="preserve">Parte B — Reto: interrupción real y bases de datos sin montar</w:t>
-      </w:r>
-    </w:p>
-    <w:p>
-      <w:pPr>
-        <w:spacing w:after="120"/>
       </w:pPr>
     </w:p>
     <w:p>
@@ -847,7 +768,7 @@
           <w:sz w:val="24"/>
           <w:szCs w:val="24"/>
         </w:rPr>
-        <w:t xml:space="preserve">Conmutación por error medida con precisión</w:t>
+        <w:t xml:space="preserve">Paso 6 — Multi-AZ y conmutación por error real</w:t>
       </w:r>
     </w:p>
     <w:p>
@@ -861,7 +782,7 @@
           <w:sz w:val="22"/>
           <w:szCs w:val="22"/>
         </w:rPr>
-        <w:t xml:space="preserve">Activa Multi-AZ y fuerza una conmutación. Mide con precisión cuánto tiempo real está la aplicación sin poder consultar la base de datos, desde el primer error hasta la primera consulta correcta tras la conmutación.</w:t>
+        <w:t xml:space="preserve">Tu predicción (antes de provocar la conmutación): ¿cuántos segundos crees que va a durar la interrupción?</w:t>
       </w:r>
     </w:p>
     <w:tbl>
@@ -880,41 +801,8 @@
         <w:gridCol w:w="9638"/>
       </w:tblGrid>
       <w:tr>
-        <w:tc>
-          <w:tcPr>
-            <w:tcW w:type="dxa" w:w="9638"/>
-            <w:tcBorders>
-              <w:top w:val="none" w:color="FFFFFF" w:sz="0"/>
-              <w:left w:val="none" w:color="FFFFFF" w:sz="0"/>
-              <w:bottom w:val="none" w:color="FFFFFF" w:sz="0"/>
-              <w:right w:val="none" w:color="FFFFFF" w:sz="0"/>
-            </w:tcBorders>
-            <w:shd w:fill="3949AB" w:val="clear"/>
-            <w:tcMar>
-              <w:top w:type="dxa" w:w="80"/>
-              <w:left w:type="dxa" w:w="160"/>
-              <w:bottom w:type="dxa" w:w="80"/>
-              <w:right w:type="dxa" w:w="160"/>
-            </w:tcMar>
-          </w:tcPr>
-          <w:p>
-            <w:r>
-              <w:rPr>
-                <w:rFonts w:ascii="Arial" w:cs="Arial" w:eastAsia="Arial" w:hAnsi="Arial"/>
-                <w:b/>
-                <w:bCs/>
-                <w:color w:val="FFFFFF"/>
-                <w:sz w:val="20"/>
-                <w:szCs w:val="20"/>
-              </w:rPr>
-              <w:t xml:space="preserve">📸 Cronómetro o registro de la interrupción real</w:t>
-            </w:r>
-          </w:p>
-        </w:tc>
-      </w:tr>
-      <w:tr>
         <w:trPr>
-          <w:trHeight w:val="2400"/>
+          <w:trHeight w:val="480"/>
         </w:trPr>
         <w:tc>
           <w:tcPr>
@@ -927,26 +815,51 @@
             </w:tcBorders>
             <w:shd w:fill="FAFAFA" w:val="clear"/>
             <w:tcMar>
-              <w:top w:type="dxa" w:w="80"/>
-              <w:left w:type="dxa" w:w="160"/>
-              <w:bottom w:type="dxa" w:w="80"/>
-              <w:right w:type="dxa" w:w="160"/>
-            </w:tcMar>
-          </w:tcPr>
-          <w:p>
-            <w:pPr>
-              <w:jc w:val="center"/>
-            </w:pPr>
-            <w:r>
-              <w:rPr>
-                <w:rFonts w:ascii="Arial" w:cs="Arial" w:eastAsia="Arial" w:hAnsi="Arial"/>
-                <w:i/>
-                <w:iCs/>
-                <w:color w:val="757575"/>
-                <w:sz w:val="20"/>
-                <w:szCs w:val="20"/>
-              </w:rPr>
-              <w:t xml:space="preserve">[Pega aquí la captura de pantalla]</w:t>
+              <w:top w:type="dxa" w:w="60"/>
+              <w:left w:type="dxa" w:w="160"/>
+              <w:bottom w:type="dxa" w:w="60"/>
+              <w:right w:type="dxa" w:w="160"/>
+            </w:tcMar>
+          </w:tcPr>
+          <w:p>
+            <w:r>
+              <w:rPr>
+                <w:sz w:val="22"/>
+                <w:szCs w:val="22"/>
+              </w:rPr>
+              <w:t xml:space="preserve"/>
+            </w:r>
+          </w:p>
+        </w:tc>
+      </w:tr>
+      <w:tr>
+        <w:trPr>
+          <w:trHeight w:val="480"/>
+        </w:trPr>
+        <w:tc>
+          <w:tcPr>
+            <w:tcW w:type="dxa" w:w="9638"/>
+            <w:tcBorders>
+              <w:top w:val="single" w:color="E0E0E0" w:sz="4"/>
+              <w:left w:val="single" w:color="E0E0E0" w:sz="4"/>
+              <w:bottom w:val="single" w:color="E0E0E0" w:sz="4"/>
+              <w:right w:val="single" w:color="E0E0E0" w:sz="4"/>
+            </w:tcBorders>
+            <w:shd w:fill="FAFAFA" w:val="clear"/>
+            <w:tcMar>
+              <w:top w:type="dxa" w:w="60"/>
+              <w:left w:type="dxa" w:w="160"/>
+              <w:bottom w:type="dxa" w:w="60"/>
+              <w:right w:type="dxa" w:w="160"/>
+            </w:tcMar>
+          </w:tcPr>
+          <w:p>
+            <w:r>
+              <w:rPr>
+                <w:sz w:val="22"/>
+                <w:szCs w:val="22"/>
+              </w:rPr>
+              <w:t xml:space="preserve"/>
             </w:r>
           </w:p>
         </w:tc>
@@ -954,41 +867,8 @@
     </w:tbl>
     <w:p>
       <w:pPr>
-        <w:spacing w:after="160"/>
-      </w:pPr>
-    </w:p>
-    <w:p>
-      <w:pPr>
-        <w:pBdr>
-          <w:bottom w:val="single" w:color="FFA000" w:sz="4" w:space="1"/>
-        </w:pBdr>
-        <w:spacing w:after="120" w:before="240"/>
-      </w:pPr>
-      <w:r>
-        <w:rPr>
-          <w:rFonts w:ascii="Arial" w:cs="Arial" w:eastAsia="Arial" w:hAnsi="Arial"/>
-          <w:b/>
-          <w:bCs/>
-          <w:color w:val="3949AB"/>
-          <w:sz w:val="24"/>
-          <w:szCs w:val="24"/>
-        </w:rPr>
-        <w:t xml:space="preserve">Clasifica sin montar nada: tres patrones de acceso</w:t>
-      </w:r>
-    </w:p>
-    <w:p>
-      <w:pPr>
-        <w:spacing w:after="100"/>
-      </w:pPr>
-      <w:r>
-        <w:rPr>
-          <w:rFonts w:ascii="Arial" w:cs="Arial" w:eastAsia="Arial" w:hAnsi="Arial"/>
-          <w:color w:val="212121"/>
-          <w:sz w:val="22"/>
-          <w:szCs w:val="22"/>
-        </w:rPr>
-        <w:t xml:space="preserve">Para cada patrón (sesión temporal del usuario que consulta el catálogo, catálogo de la biblioteca con ítems de atributos muy distintos, histórico de préstamos con informes cruzados), decide qué modelo de base de datos (relacional, clave-valor o documental) encaja mejor y justifica por qué los otros dos encajan peor.</w:t>
-      </w:r>
+        <w:spacing w:after="120"/>
+      </w:pPr>
     </w:p>
     <w:tbl>
       <w:tblPr>
@@ -1003,32 +883,27 @@
         </w:tblBorders>
       </w:tblPr>
       <w:tblGrid>
-        <w:gridCol w:w="3084"/>
-        <w:gridCol w:w="1735"/>
-        <w:gridCol w:w="4819"/>
+        <w:gridCol w:w="9638"/>
       </w:tblGrid>
       <w:tr>
         <w:tc>
           <w:tcPr>
-            <w:tcW w:type="dxa" w:w="3084"/>
-            <w:tcBorders>
-              <w:top w:val="single" w:color="E0E0E0" w:sz="4"/>
-              <w:left w:val="single" w:color="E0E0E0" w:sz="4"/>
-              <w:bottom w:val="single" w:color="E0E0E0" w:sz="4"/>
-              <w:right w:val="single" w:color="E0E0E0" w:sz="4"/>
+            <w:tcW w:type="dxa" w:w="9638"/>
+            <w:tcBorders>
+              <w:top w:val="none" w:color="FFFFFF" w:sz="0"/>
+              <w:left w:val="none" w:color="FFFFFF" w:sz="0"/>
+              <w:bottom w:val="none" w:color="FFFFFF" w:sz="0"/>
+              <w:right w:val="none" w:color="FFFFFF" w:sz="0"/>
             </w:tcBorders>
             <w:shd w:fill="3949AB" w:val="clear"/>
             <w:tcMar>
-              <w:top w:type="dxa" w:w="100"/>
-              <w:left w:type="dxa" w:w="140"/>
-              <w:bottom w:type="dxa" w:w="100"/>
-              <w:right w:type="dxa" w:w="100"/>
-            </w:tcMar>
-          </w:tcPr>
-          <w:p>
-            <w:pPr>
-              <w:jc w:val="center"/>
-            </w:pPr>
+              <w:top w:type="dxa" w:w="80"/>
+              <w:left w:type="dxa" w:w="160"/>
+              <w:bottom w:type="dxa" w:w="80"/>
+              <w:right w:type="dxa" w:w="160"/>
+            </w:tcMar>
+          </w:tcPr>
+          <w:p>
             <w:r>
               <w:rPr>
                 <w:rFonts w:ascii="Arial" w:cs="Arial" w:eastAsia="Arial" w:hAnsi="Arial"/>
@@ -1038,31 +913,114 @@
                 <w:sz w:val="20"/>
                 <w:szCs w:val="20"/>
               </w:rPr>
-              <w:t xml:space="preserve">Patrón de acceso</w:t>
-            </w:r>
-          </w:p>
-        </w:tc>
-        <w:tc>
-          <w:tcPr>
-            <w:tcW w:type="dxa" w:w="1735"/>
+              <w:t xml:space="preserve">📸 Salida del bucle de comprobación mostrando el momento exacto de la interrupción y la recuperación</w:t>
+            </w:r>
+          </w:p>
+        </w:tc>
+      </w:tr>
+      <w:tr>
+        <w:trPr>
+          <w:trHeight w:val="2400"/>
+        </w:trPr>
+        <w:tc>
+          <w:tcPr>
+            <w:tcW w:type="dxa" w:w="9638"/>
             <w:tcBorders>
               <w:top w:val="single" w:color="E0E0E0" w:sz="4"/>
               <w:left w:val="single" w:color="E0E0E0" w:sz="4"/>
               <w:bottom w:val="single" w:color="E0E0E0" w:sz="4"/>
               <w:right w:val="single" w:color="E0E0E0" w:sz="4"/>
             </w:tcBorders>
-            <w:shd w:fill="3949AB" w:val="clear"/>
-            <w:tcMar>
-              <w:top w:type="dxa" w:w="100"/>
-              <w:left w:type="dxa" w:w="140"/>
-              <w:bottom w:type="dxa" w:w="100"/>
-              <w:right w:type="dxa" w:w="100"/>
+            <w:shd w:fill="FAFAFA" w:val="clear"/>
+            <w:tcMar>
+              <w:top w:type="dxa" w:w="80"/>
+              <w:left w:type="dxa" w:w="160"/>
+              <w:bottom w:type="dxa" w:w="80"/>
+              <w:right w:type="dxa" w:w="160"/>
             </w:tcMar>
           </w:tcPr>
           <w:p>
             <w:pPr>
               <w:jc w:val="center"/>
             </w:pPr>
+            <w:r>
+              <w:rPr>
+                <w:rFonts w:ascii="Arial" w:cs="Arial" w:eastAsia="Arial" w:hAnsi="Arial"/>
+                <w:i/>
+                <w:iCs/>
+                <w:color w:val="757575"/>
+                <w:sz w:val="20"/>
+                <w:szCs w:val="20"/>
+              </w:rPr>
+              <w:t xml:space="preserve">[Pega aquí la captura de pantalla]</w:t>
+            </w:r>
+          </w:p>
+        </w:tc>
+      </w:tr>
+    </w:tbl>
+    <w:p>
+      <w:pPr>
+        <w:spacing w:after="200"/>
+      </w:pPr>
+    </w:p>
+    <w:p>
+      <w:r>
+        <w:br w:type="page"/>
+      </w:r>
+    </w:p>
+    <w:p>
+      <w:pPr>
+        <w:pBdr>
+          <w:bottom w:val="single" w:color="FFA000" w:sz="4" w:space="1"/>
+        </w:pBdr>
+        <w:spacing w:after="120" w:before="240"/>
+      </w:pPr>
+      <w:r>
+        <w:rPr>
+          <w:rFonts w:ascii="Arial" w:cs="Arial" w:eastAsia="Arial" w:hAnsi="Arial"/>
+          <w:b/>
+          <w:bCs/>
+          <w:color w:val="3949AB"/>
+          <w:sz w:val="24"/>
+          <w:szCs w:val="24"/>
+        </w:rPr>
+        <w:t xml:space="preserve">Paso 7 — Backups automáticos frente a snapshot manual</w:t>
+      </w:r>
+    </w:p>
+    <w:tbl>
+      <w:tblPr>
+        <w:tblW w:type="dxa" w:w="9638"/>
+        <w:tblBorders>
+          <w:top w:val="single" w:color="auto" w:sz="4"/>
+          <w:left w:val="single" w:color="auto" w:sz="4"/>
+          <w:bottom w:val="single" w:color="auto" w:sz="4"/>
+          <w:right w:val="single" w:color="auto" w:sz="4"/>
+          <w:insideH w:val="single" w:color="auto" w:sz="4"/>
+          <w:insideV w:val="single" w:color="auto" w:sz="4"/>
+        </w:tblBorders>
+      </w:tblPr>
+      <w:tblGrid>
+        <w:gridCol w:w="9638"/>
+      </w:tblGrid>
+      <w:tr>
+        <w:tc>
+          <w:tcPr>
+            <w:tcW w:type="dxa" w:w="9638"/>
+            <w:tcBorders>
+              <w:top w:val="none" w:color="FFFFFF" w:sz="0"/>
+              <w:left w:val="none" w:color="FFFFFF" w:sz="0"/>
+              <w:bottom w:val="none" w:color="FFFFFF" w:sz="0"/>
+              <w:right w:val="none" w:color="FFFFFF" w:sz="0"/>
+            </w:tcBorders>
+            <w:shd w:fill="3949AB" w:val="clear"/>
+            <w:tcMar>
+              <w:top w:type="dxa" w:w="80"/>
+              <w:left w:type="dxa" w:w="160"/>
+              <w:bottom w:type="dxa" w:w="80"/>
+              <w:right w:type="dxa" w:w="160"/>
+            </w:tcMar>
+          </w:tcPr>
+          <w:p>
             <w:r>
               <w:rPr>
                 <w:rFonts w:ascii="Arial" w:cs="Arial" w:eastAsia="Arial" w:hAnsi="Arial"/>
@@ -1072,31 +1030,109 @@
                 <w:sz w:val="20"/>
                 <w:szCs w:val="20"/>
               </w:rPr>
-              <w:t xml:space="preserve">Modelo elegido</w:t>
-            </w:r>
-          </w:p>
-        </w:tc>
-        <w:tc>
-          <w:tcPr>
-            <w:tcW w:type="dxa" w:w="4819"/>
+              <w:t xml:space="preserve">📸 Snapshot manual en la lista de instantáneas, y ventana de retención de los backups automáticos</w:t>
+            </w:r>
+          </w:p>
+        </w:tc>
+      </w:tr>
+      <w:tr>
+        <w:trPr>
+          <w:trHeight w:val="2400"/>
+        </w:trPr>
+        <w:tc>
+          <w:tcPr>
+            <w:tcW w:type="dxa" w:w="9638"/>
             <w:tcBorders>
               <w:top w:val="single" w:color="E0E0E0" w:sz="4"/>
               <w:left w:val="single" w:color="E0E0E0" w:sz="4"/>
               <w:bottom w:val="single" w:color="E0E0E0" w:sz="4"/>
               <w:right w:val="single" w:color="E0E0E0" w:sz="4"/>
             </w:tcBorders>
-            <w:shd w:fill="3949AB" w:val="clear"/>
-            <w:tcMar>
-              <w:top w:type="dxa" w:w="100"/>
-              <w:left w:type="dxa" w:w="140"/>
-              <w:bottom w:type="dxa" w:w="100"/>
-              <w:right w:type="dxa" w:w="100"/>
+            <w:shd w:fill="FAFAFA" w:val="clear"/>
+            <w:tcMar>
+              <w:top w:type="dxa" w:w="80"/>
+              <w:left w:type="dxa" w:w="160"/>
+              <w:bottom w:type="dxa" w:w="80"/>
+              <w:right w:type="dxa" w:w="160"/>
             </w:tcMar>
           </w:tcPr>
           <w:p>
             <w:pPr>
               <w:jc w:val="center"/>
             </w:pPr>
+            <w:r>
+              <w:rPr>
+                <w:rFonts w:ascii="Arial" w:cs="Arial" w:eastAsia="Arial" w:hAnsi="Arial"/>
+                <w:i/>
+                <w:iCs/>
+                <w:color w:val="757575"/>
+                <w:sz w:val="20"/>
+                <w:szCs w:val="20"/>
+              </w:rPr>
+              <w:t xml:space="preserve">[Pega aquí la captura de pantalla]</w:t>
+            </w:r>
+          </w:p>
+        </w:tc>
+      </w:tr>
+    </w:tbl>
+    <w:p>
+      <w:pPr>
+        <w:spacing w:after="200"/>
+      </w:pPr>
+    </w:p>
+    <w:p>
+      <w:pPr>
+        <w:pBdr>
+          <w:bottom w:val="single" w:color="FFA000" w:sz="4" w:space="1"/>
+        </w:pBdr>
+        <w:spacing w:after="120" w:before="240"/>
+      </w:pPr>
+      <w:r>
+        <w:rPr>
+          <w:rFonts w:ascii="Arial" w:cs="Arial" w:eastAsia="Arial" w:hAnsi="Arial"/>
+          <w:b/>
+          <w:bCs/>
+          <w:color w:val="3949AB"/>
+          <w:sz w:val="24"/>
+          <w:szCs w:val="24"/>
+        </w:rPr>
+        <w:t xml:space="preserve">Paso 8 — Réplica de lectura</w:t>
+      </w:r>
+    </w:p>
+    <w:tbl>
+      <w:tblPr>
+        <w:tblW w:type="dxa" w:w="9638"/>
+        <w:tblBorders>
+          <w:top w:val="single" w:color="auto" w:sz="4"/>
+          <w:left w:val="single" w:color="auto" w:sz="4"/>
+          <w:bottom w:val="single" w:color="auto" w:sz="4"/>
+          <w:right w:val="single" w:color="auto" w:sz="4"/>
+          <w:insideH w:val="single" w:color="auto" w:sz="4"/>
+          <w:insideV w:val="single" w:color="auto" w:sz="4"/>
+        </w:tblBorders>
+      </w:tblPr>
+      <w:tblGrid>
+        <w:gridCol w:w="9638"/>
+      </w:tblGrid>
+      <w:tr>
+        <w:tc>
+          <w:tcPr>
+            <w:tcW w:type="dxa" w:w="9638"/>
+            <w:tcBorders>
+              <w:top w:val="none" w:color="FFFFFF" w:sz="0"/>
+              <w:left w:val="none" w:color="FFFFFF" w:sz="0"/>
+              <w:bottom w:val="none" w:color="FFFFFF" w:sz="0"/>
+              <w:right w:val="none" w:color="FFFFFF" w:sz="0"/>
+            </w:tcBorders>
+            <w:shd w:fill="3949AB" w:val="clear"/>
+            <w:tcMar>
+              <w:top w:type="dxa" w:w="80"/>
+              <w:left w:type="dxa" w:w="160"/>
+              <w:bottom w:type="dxa" w:w="80"/>
+              <w:right w:type="dxa" w:w="160"/>
+            </w:tcMar>
+          </w:tcPr>
+          <w:p>
             <w:r>
               <w:rPr>
                 <w:rFonts w:ascii="Arial" w:cs="Arial" w:eastAsia="Arial" w:hAnsi="Arial"/>
@@ -1106,57 +1142,123 @@
                 <w:sz w:val="20"/>
                 <w:szCs w:val="20"/>
               </w:rPr>
-              <w:t xml:space="preserve">Justificación</w:t>
+              <w:t xml:space="preserve">📸 Réplica de lectura creada, y el error de PostgreSQL al intentar escribir en ella</w:t>
             </w:r>
           </w:p>
         </w:tc>
       </w:tr>
       <w:tr>
         <w:trPr>
-          <w:trHeight w:val="800"/>
+          <w:trHeight w:val="2400"/>
         </w:trPr>
         <w:tc>
           <w:tcPr>
-            <w:tcW w:type="dxa" w:w="3084"/>
+            <w:tcW w:type="dxa" w:w="9638"/>
             <w:tcBorders>
               <w:top w:val="single" w:color="E0E0E0" w:sz="4"/>
               <w:left w:val="single" w:color="E0E0E0" w:sz="4"/>
               <w:bottom w:val="single" w:color="E0E0E0" w:sz="4"/>
               <w:right w:val="single" w:color="E0E0E0" w:sz="4"/>
             </w:tcBorders>
-            <w:shd w:fill="FFFFFF" w:val="clear"/>
+            <w:shd w:fill="FAFAFA" w:val="clear"/>
             <w:tcMar>
               <w:top w:type="dxa" w:w="80"/>
-              <w:left w:type="dxa" w:w="140"/>
+              <w:left w:type="dxa" w:w="160"/>
               <w:bottom w:type="dxa" w:w="80"/>
-              <w:right w:type="dxa" w:w="100"/>
-            </w:tcMar>
-          </w:tcPr>
-          <w:p>
-            <w:r>
-              <w:rPr>
-                <w:sz w:val="22"/>
-                <w:szCs w:val="22"/>
-              </w:rPr>
-              <w:t xml:space="preserve"/>
-            </w:r>
-          </w:p>
-        </w:tc>
-        <w:tc>
-          <w:tcPr>
-            <w:tcW w:type="dxa" w:w="1735"/>
+              <w:right w:type="dxa" w:w="160"/>
+            </w:tcMar>
+          </w:tcPr>
+          <w:p>
+            <w:pPr>
+              <w:jc w:val="center"/>
+            </w:pPr>
+            <w:r>
+              <w:rPr>
+                <w:rFonts w:ascii="Arial" w:cs="Arial" w:eastAsia="Arial" w:hAnsi="Arial"/>
+                <w:i/>
+                <w:iCs/>
+                <w:color w:val="757575"/>
+                <w:sz w:val="20"/>
+                <w:szCs w:val="20"/>
+              </w:rPr>
+              <w:t xml:space="preserve">[Pega aquí la captura de pantalla]</w:t>
+            </w:r>
+          </w:p>
+        </w:tc>
+      </w:tr>
+    </w:tbl>
+    <w:p>
+      <w:pPr>
+        <w:spacing w:after="160"/>
+      </w:pPr>
+    </w:p>
+    <w:p>
+      <w:pPr>
+        <w:pBdr>
+          <w:bottom w:val="single" w:color="FFA000" w:sz="4" w:space="1"/>
+        </w:pBdr>
+        <w:spacing w:after="120" w:before="240"/>
+      </w:pPr>
+      <w:r>
+        <w:rPr>
+          <w:rFonts w:ascii="Arial" w:cs="Arial" w:eastAsia="Arial" w:hAnsi="Arial"/>
+          <w:b/>
+          <w:bCs/>
+          <w:color w:val="3949AB"/>
+          <w:sz w:val="24"/>
+          <w:szCs w:val="24"/>
+        </w:rPr>
+        <w:t xml:space="preserve">Reflexiona</w:t>
+      </w:r>
+    </w:p>
+    <w:p>
+      <w:pPr>
+        <w:spacing w:after="100"/>
+      </w:pPr>
+      <w:r>
+        <w:rPr>
+          <w:rFonts w:ascii="Arial" w:cs="Arial" w:eastAsia="Arial" w:hAnsi="Arial"/>
+          <w:color w:val="212121"/>
+          <w:sz w:val="22"/>
+          <w:szCs w:val="22"/>
+        </w:rPr>
+        <w:t xml:space="preserve">Si tu presupuesto solo te permitiera activar Multi-AZ o una réplica de lectura, ¿cuál elegirías para Escaparate en producción real, sabiendo que es una tienda con más visitas navegando el catálogo que compras completándose?</w:t>
+      </w:r>
+    </w:p>
+    <w:tbl>
+      <w:tblPr>
+        <w:tblW w:type="dxa" w:w="9638"/>
+        <w:tblBorders>
+          <w:top w:val="single" w:color="auto" w:sz="4"/>
+          <w:left w:val="single" w:color="auto" w:sz="4"/>
+          <w:bottom w:val="single" w:color="auto" w:sz="4"/>
+          <w:right w:val="single" w:color="auto" w:sz="4"/>
+          <w:insideH w:val="single" w:color="auto" w:sz="4"/>
+          <w:insideV w:val="single" w:color="auto" w:sz="4"/>
+        </w:tblBorders>
+      </w:tblPr>
+      <w:tblGrid>
+        <w:gridCol w:w="9638"/>
+      </w:tblGrid>
+      <w:tr>
+        <w:trPr>
+          <w:trHeight w:val="480"/>
+        </w:trPr>
+        <w:tc>
+          <w:tcPr>
+            <w:tcW w:type="dxa" w:w="9638"/>
             <w:tcBorders>
               <w:top w:val="single" w:color="E0E0E0" w:sz="4"/>
               <w:left w:val="single" w:color="E0E0E0" w:sz="4"/>
               <w:bottom w:val="single" w:color="E0E0E0" w:sz="4"/>
               <w:right w:val="single" w:color="E0E0E0" w:sz="4"/>
             </w:tcBorders>
-            <w:shd w:fill="FFFFFF" w:val="clear"/>
-            <w:tcMar>
-              <w:top w:type="dxa" w:w="80"/>
-              <w:left w:type="dxa" w:w="140"/>
-              <w:bottom w:type="dxa" w:w="80"/>
-              <w:right w:type="dxa" w:w="100"/>
+            <w:shd w:fill="FAFAFA" w:val="clear"/>
+            <w:tcMar>
+              <w:top w:type="dxa" w:w="60"/>
+              <w:left w:type="dxa" w:w="160"/>
+              <w:bottom w:type="dxa" w:w="60"/>
+              <w:right w:type="dxa" w:w="160"/>
             </w:tcMar>
           </w:tcPr>
           <w:p>
@@ -1169,21 +1271,26 @@
             </w:r>
           </w:p>
         </w:tc>
-        <w:tc>
-          <w:tcPr>
-            <w:tcW w:type="dxa" w:w="4819"/>
+      </w:tr>
+      <w:tr>
+        <w:trPr>
+          <w:trHeight w:val="480"/>
+        </w:trPr>
+        <w:tc>
+          <w:tcPr>
+            <w:tcW w:type="dxa" w:w="9638"/>
             <w:tcBorders>
               <w:top w:val="single" w:color="E0E0E0" w:sz="4"/>
               <w:left w:val="single" w:color="E0E0E0" w:sz="4"/>
               <w:bottom w:val="single" w:color="E0E0E0" w:sz="4"/>
               <w:right w:val="single" w:color="E0E0E0" w:sz="4"/>
             </w:tcBorders>
-            <w:shd w:fill="FFFFFF" w:val="clear"/>
-            <w:tcMar>
-              <w:top w:type="dxa" w:w="80"/>
-              <w:left w:type="dxa" w:w="140"/>
-              <w:bottom w:type="dxa" w:w="80"/>
-              <w:right w:type="dxa" w:w="100"/>
+            <w:shd w:fill="FAFAFA" w:val="clear"/>
+            <w:tcMar>
+              <w:top w:type="dxa" w:w="60"/>
+              <w:left w:type="dxa" w:w="160"/>
+              <w:bottom w:type="dxa" w:w="60"/>
+              <w:right w:type="dxa" w:w="160"/>
             </w:tcMar>
           </w:tcPr>
           <w:p>
@@ -1199,23 +1306,23 @@
       </w:tr>
       <w:tr>
         <w:trPr>
-          <w:trHeight w:val="800"/>
+          <w:trHeight w:val="480"/>
         </w:trPr>
         <w:tc>
           <w:tcPr>
-            <w:tcW w:type="dxa" w:w="3084"/>
+            <w:tcW w:type="dxa" w:w="9638"/>
             <w:tcBorders>
               <w:top w:val="single" w:color="E0E0E0" w:sz="4"/>
               <w:left w:val="single" w:color="E0E0E0" w:sz="4"/>
               <w:bottom w:val="single" w:color="E0E0E0" w:sz="4"/>
               <w:right w:val="single" w:color="E0E0E0" w:sz="4"/>
             </w:tcBorders>
-            <w:shd w:fill="F5F5F5" w:val="clear"/>
-            <w:tcMar>
-              <w:top w:type="dxa" w:w="80"/>
-              <w:left w:type="dxa" w:w="140"/>
-              <w:bottom w:type="dxa" w:w="80"/>
-              <w:right w:type="dxa" w:w="100"/>
+            <w:shd w:fill="FAFAFA" w:val="clear"/>
+            <w:tcMar>
+              <w:top w:type="dxa" w:w="60"/>
+              <w:left w:type="dxa" w:w="160"/>
+              <w:bottom w:type="dxa" w:w="60"/>
+              <w:right w:type="dxa" w:w="160"/>
             </w:tcMar>
           </w:tcPr>
           <w:p>
@@ -1228,21 +1335,26 @@
             </w:r>
           </w:p>
         </w:tc>
-        <w:tc>
-          <w:tcPr>
-            <w:tcW w:type="dxa" w:w="1735"/>
+      </w:tr>
+      <w:tr>
+        <w:trPr>
+          <w:trHeight w:val="480"/>
+        </w:trPr>
+        <w:tc>
+          <w:tcPr>
+            <w:tcW w:type="dxa" w:w="9638"/>
             <w:tcBorders>
               <w:top w:val="single" w:color="E0E0E0" w:sz="4"/>
               <w:left w:val="single" w:color="E0E0E0" w:sz="4"/>
               <w:bottom w:val="single" w:color="E0E0E0" w:sz="4"/>
               <w:right w:val="single" w:color="E0E0E0" w:sz="4"/>
             </w:tcBorders>
-            <w:shd w:fill="F5F5F5" w:val="clear"/>
-            <w:tcMar>
-              <w:top w:type="dxa" w:w="80"/>
-              <w:left w:type="dxa" w:w="140"/>
-              <w:bottom w:type="dxa" w:w="80"/>
-              <w:right w:type="dxa" w:w="100"/>
+            <w:shd w:fill="FAFAFA" w:val="clear"/>
+            <w:tcMar>
+              <w:top w:type="dxa" w:w="60"/>
+              <w:left w:type="dxa" w:w="160"/>
+              <w:bottom w:type="dxa" w:w="60"/>
+              <w:right w:type="dxa" w:w="160"/>
             </w:tcMar>
           </w:tcPr>
           <w:p>
@@ -1255,53 +1367,220 @@
             </w:r>
           </w:p>
         </w:tc>
-        <w:tc>
-          <w:tcPr>
-            <w:tcW w:type="dxa" w:w="4819"/>
+      </w:tr>
+    </w:tbl>
+    <w:p>
+      <w:pPr>
+        <w:spacing w:after="200"/>
+      </w:pPr>
+    </w:p>
+    <w:p>
+      <w:r>
+        <w:br w:type="page"/>
+      </w:r>
+    </w:p>
+    <w:p>
+      <w:pPr>
+        <w:shd w:fill="3949AB" w:val="clear"/>
+        <w:spacing w:after="0" w:before="320"/>
+        <w:ind w:left="200" w:right="200"/>
+      </w:pPr>
+      <w:r>
+        <w:rPr>
+          <w:rFonts w:ascii="Arial" w:cs="Arial" w:eastAsia="Arial" w:hAnsi="Arial"/>
+          <w:b/>
+          <w:bCs/>
+          <w:color w:val="FFFFFF"/>
+          <w:sz w:val="26"/>
+          <w:szCs w:val="26"/>
+        </w:rPr>
+        <w:t xml:space="preserve">Parte B — Reto: comprueba que existe otra familia, y razona sobre una tercera</w:t>
+      </w:r>
+    </w:p>
+    <w:p>
+      <w:pPr>
+        <w:spacing w:after="120"/>
+      </w:pPr>
+    </w:p>
+    <w:p>
+      <w:pPr>
+        <w:pBdr>
+          <w:bottom w:val="single" w:color="FFA000" w:sz="4" w:space="1"/>
+        </w:pBdr>
+        <w:spacing w:after="120" w:before="240"/>
+      </w:pPr>
+      <w:r>
+        <w:rPr>
+          <w:rFonts w:ascii="Arial" w:cs="Arial" w:eastAsia="Arial" w:hAnsi="Arial"/>
+          <w:b/>
+          <w:bCs/>
+          <w:color w:val="3949AB"/>
+          <w:sz w:val="24"/>
+          <w:szCs w:val="24"/>
+        </w:rPr>
+        <w:t xml:space="preserve">Existe de verdad: DynamoDB</w:t>
+      </w:r>
+    </w:p>
+    <w:tbl>
+      <w:tblPr>
+        <w:tblW w:type="dxa" w:w="9638"/>
+        <w:tblBorders>
+          <w:top w:val="single" w:color="auto" w:sz="4"/>
+          <w:left w:val="single" w:color="auto" w:sz="4"/>
+          <w:bottom w:val="single" w:color="auto" w:sz="4"/>
+          <w:right w:val="single" w:color="auto" w:sz="4"/>
+          <w:insideH w:val="single" w:color="auto" w:sz="4"/>
+          <w:insideV w:val="single" w:color="auto" w:sz="4"/>
+        </w:tblBorders>
+      </w:tblPr>
+      <w:tblGrid>
+        <w:gridCol w:w="9638"/>
+      </w:tblGrid>
+      <w:tr>
+        <w:tc>
+          <w:tcPr>
+            <w:tcW w:type="dxa" w:w="9638"/>
+            <w:tcBorders>
+              <w:top w:val="none" w:color="FFFFFF" w:sz="0"/>
+              <w:left w:val="none" w:color="FFFFFF" w:sz="0"/>
+              <w:bottom w:val="none" w:color="FFFFFF" w:sz="0"/>
+              <w:right w:val="none" w:color="FFFFFF" w:sz="0"/>
+            </w:tcBorders>
+            <w:shd w:fill="3949AB" w:val="clear"/>
+            <w:tcMar>
+              <w:top w:type="dxa" w:w="80"/>
+              <w:left w:type="dxa" w:w="160"/>
+              <w:bottom w:type="dxa" w:w="80"/>
+              <w:right w:type="dxa" w:w="160"/>
+            </w:tcMar>
+          </w:tcPr>
+          <w:p>
+            <w:r>
+              <w:rPr>
+                <w:rFonts w:ascii="Arial" w:cs="Arial" w:eastAsia="Arial" w:hAnsi="Arial"/>
+                <w:b/>
+                <w:bCs/>
+                <w:color w:val="FFFFFF"/>
+                <w:sz w:val="20"/>
+                <w:szCs w:val="20"/>
+              </w:rPr>
+              <w:t xml:space="preserve">📸 Tabla DynamoDB creada, y la lectura del elemento insertado</w:t>
+            </w:r>
+          </w:p>
+        </w:tc>
+      </w:tr>
+      <w:tr>
+        <w:trPr>
+          <w:trHeight w:val="2400"/>
+        </w:trPr>
+        <w:tc>
+          <w:tcPr>
+            <w:tcW w:type="dxa" w:w="9638"/>
             <w:tcBorders>
               <w:top w:val="single" w:color="E0E0E0" w:sz="4"/>
               <w:left w:val="single" w:color="E0E0E0" w:sz="4"/>
               <w:bottom w:val="single" w:color="E0E0E0" w:sz="4"/>
               <w:right w:val="single" w:color="E0E0E0" w:sz="4"/>
             </w:tcBorders>
-            <w:shd w:fill="F5F5F5" w:val="clear"/>
+            <w:shd w:fill="FAFAFA" w:val="clear"/>
             <w:tcMar>
               <w:top w:type="dxa" w:w="80"/>
-              <w:left w:type="dxa" w:w="140"/>
+              <w:left w:type="dxa" w:w="160"/>
               <w:bottom w:type="dxa" w:w="80"/>
-              <w:right w:type="dxa" w:w="100"/>
-            </w:tcMar>
-          </w:tcPr>
-          <w:p>
-            <w:r>
-              <w:rPr>
-                <w:sz w:val="22"/>
-                <w:szCs w:val="22"/>
-              </w:rPr>
-              <w:t xml:space="preserve"/>
-            </w:r>
-          </w:p>
-        </w:tc>
-      </w:tr>
+              <w:right w:type="dxa" w:w="160"/>
+            </w:tcMar>
+          </w:tcPr>
+          <w:p>
+            <w:pPr>
+              <w:jc w:val="center"/>
+            </w:pPr>
+            <w:r>
+              <w:rPr>
+                <w:rFonts w:ascii="Arial" w:cs="Arial" w:eastAsia="Arial" w:hAnsi="Arial"/>
+                <w:i/>
+                <w:iCs/>
+                <w:color w:val="757575"/>
+                <w:sz w:val="20"/>
+                <w:szCs w:val="20"/>
+              </w:rPr>
+              <w:t xml:space="preserve">[Pega aquí la captura de pantalla]</w:t>
+            </w:r>
+          </w:p>
+        </w:tc>
+      </w:tr>
+    </w:tbl>
+    <w:p>
+      <w:pPr>
+        <w:spacing w:after="160"/>
+      </w:pPr>
+    </w:p>
+    <w:p>
+      <w:pPr>
+        <w:pBdr>
+          <w:bottom w:val="single" w:color="FFA000" w:sz="4" w:space="1"/>
+        </w:pBdr>
+        <w:spacing w:after="120" w:before="240"/>
+      </w:pPr>
+      <w:r>
+        <w:rPr>
+          <w:rFonts w:ascii="Arial" w:cs="Arial" w:eastAsia="Arial" w:hAnsi="Arial"/>
+          <w:b/>
+          <w:bCs/>
+          <w:color w:val="3949AB"/>
+          <w:sz w:val="24"/>
+          <w:szCs w:val="24"/>
+        </w:rPr>
+        <w:t xml:space="preserve">Asigna familia por caso de uso</w:t>
+      </w:r>
+    </w:p>
+    <w:p>
+      <w:pPr>
+        <w:spacing w:after="100"/>
+      </w:pPr>
+      <w:r>
+        <w:rPr>
+          <w:rFonts w:ascii="Arial" w:cs="Arial" w:eastAsia="Arial" w:hAnsi="Arial"/>
+          <w:color w:val="212121"/>
+          <w:sz w:val="22"/>
+          <w:szCs w:val="22"/>
+        </w:rPr>
+        <w:t xml:space="preserve">Para el catálogo de productos de Escaparate, el carrito o sesión de un usuario mientras navega, y una ficha de producto con campos muy distintos según la categoría: ¿qué familia (relacional, DynamoDB, DocumentDB) usarías en cada caso, y por qué?</w:t>
+      </w:r>
+    </w:p>
+    <w:tbl>
+      <w:tblPr>
+        <w:tblW w:type="dxa" w:w="9638"/>
+        <w:tblBorders>
+          <w:top w:val="single" w:color="auto" w:sz="4"/>
+          <w:left w:val="single" w:color="auto" w:sz="4"/>
+          <w:bottom w:val="single" w:color="auto" w:sz="4"/>
+          <w:right w:val="single" w:color="auto" w:sz="4"/>
+          <w:insideH w:val="single" w:color="auto" w:sz="4"/>
+          <w:insideV w:val="single" w:color="auto" w:sz="4"/>
+        </w:tblBorders>
+      </w:tblPr>
+      <w:tblGrid>
+        <w:gridCol w:w="9638"/>
+      </w:tblGrid>
       <w:tr>
         <w:trPr>
-          <w:trHeight w:val="800"/>
+          <w:trHeight w:val="480"/>
         </w:trPr>
         <w:tc>
           <w:tcPr>
-            <w:tcW w:type="dxa" w:w="3084"/>
+            <w:tcW w:type="dxa" w:w="9638"/>
             <w:tcBorders>
               <w:top w:val="single" w:color="E0E0E0" w:sz="4"/>
               <w:left w:val="single" w:color="E0E0E0" w:sz="4"/>
               <w:bottom w:val="single" w:color="E0E0E0" w:sz="4"/>
               <w:right w:val="single" w:color="E0E0E0" w:sz="4"/>
             </w:tcBorders>
-            <w:shd w:fill="FFFFFF" w:val="clear"/>
-            <w:tcMar>
-              <w:top w:type="dxa" w:w="80"/>
-              <w:left w:type="dxa" w:w="140"/>
-              <w:bottom w:type="dxa" w:w="80"/>
-              <w:right w:type="dxa" w:w="100"/>
+            <w:shd w:fill="FAFAFA" w:val="clear"/>
+            <w:tcMar>
+              <w:top w:type="dxa" w:w="60"/>
+              <w:left w:type="dxa" w:w="160"/>
+              <w:bottom w:type="dxa" w:w="60"/>
+              <w:right w:type="dxa" w:w="160"/>
             </w:tcMar>
           </w:tcPr>
           <w:p>
@@ -1314,21 +1593,26 @@
             </w:r>
           </w:p>
         </w:tc>
-        <w:tc>
-          <w:tcPr>
-            <w:tcW w:type="dxa" w:w="1735"/>
+      </w:tr>
+      <w:tr>
+        <w:trPr>
+          <w:trHeight w:val="480"/>
+        </w:trPr>
+        <w:tc>
+          <w:tcPr>
+            <w:tcW w:type="dxa" w:w="9638"/>
             <w:tcBorders>
               <w:top w:val="single" w:color="E0E0E0" w:sz="4"/>
               <w:left w:val="single" w:color="E0E0E0" w:sz="4"/>
               <w:bottom w:val="single" w:color="E0E0E0" w:sz="4"/>
               <w:right w:val="single" w:color="E0E0E0" w:sz="4"/>
             </w:tcBorders>
-            <w:shd w:fill="FFFFFF" w:val="clear"/>
-            <w:tcMar>
-              <w:top w:type="dxa" w:w="80"/>
-              <w:left w:type="dxa" w:w="140"/>
-              <w:bottom w:type="dxa" w:w="80"/>
-              <w:right w:type="dxa" w:w="100"/>
+            <w:shd w:fill="FAFAFA" w:val="clear"/>
+            <w:tcMar>
+              <w:top w:type="dxa" w:w="60"/>
+              <w:left w:type="dxa" w:w="160"/>
+              <w:bottom w:type="dxa" w:w="60"/>
+              <w:right w:type="dxa" w:w="160"/>
             </w:tcMar>
           </w:tcPr>
           <w:p>
@@ -1341,21 +1625,122 @@
             </w:r>
           </w:p>
         </w:tc>
-        <w:tc>
-          <w:tcPr>
-            <w:tcW w:type="dxa" w:w="4819"/>
+      </w:tr>
+      <w:tr>
+        <w:trPr>
+          <w:trHeight w:val="480"/>
+        </w:trPr>
+        <w:tc>
+          <w:tcPr>
+            <w:tcW w:type="dxa" w:w="9638"/>
             <w:tcBorders>
               <w:top w:val="single" w:color="E0E0E0" w:sz="4"/>
               <w:left w:val="single" w:color="E0E0E0" w:sz="4"/>
               <w:bottom w:val="single" w:color="E0E0E0" w:sz="4"/>
               <w:right w:val="single" w:color="E0E0E0" w:sz="4"/>
             </w:tcBorders>
-            <w:shd w:fill="FFFFFF" w:val="clear"/>
-            <w:tcMar>
-              <w:top w:type="dxa" w:w="80"/>
-              <w:left w:type="dxa" w:w="140"/>
-              <w:bottom w:type="dxa" w:w="80"/>
-              <w:right w:type="dxa" w:w="100"/>
+            <w:shd w:fill="FAFAFA" w:val="clear"/>
+            <w:tcMar>
+              <w:top w:type="dxa" w:w="60"/>
+              <w:left w:type="dxa" w:w="160"/>
+              <w:bottom w:type="dxa" w:w="60"/>
+              <w:right w:type="dxa" w:w="160"/>
+            </w:tcMar>
+          </w:tcPr>
+          <w:p>
+            <w:r>
+              <w:rPr>
+                <w:sz w:val="22"/>
+                <w:szCs w:val="22"/>
+              </w:rPr>
+              <w:t xml:space="preserve"/>
+            </w:r>
+          </w:p>
+        </w:tc>
+      </w:tr>
+      <w:tr>
+        <w:trPr>
+          <w:trHeight w:val="480"/>
+        </w:trPr>
+        <w:tc>
+          <w:tcPr>
+            <w:tcW w:type="dxa" w:w="9638"/>
+            <w:tcBorders>
+              <w:top w:val="single" w:color="E0E0E0" w:sz="4"/>
+              <w:left w:val="single" w:color="E0E0E0" w:sz="4"/>
+              <w:bottom w:val="single" w:color="E0E0E0" w:sz="4"/>
+              <w:right w:val="single" w:color="E0E0E0" w:sz="4"/>
+            </w:tcBorders>
+            <w:shd w:fill="FAFAFA" w:val="clear"/>
+            <w:tcMar>
+              <w:top w:type="dxa" w:w="60"/>
+              <w:left w:type="dxa" w:w="160"/>
+              <w:bottom w:type="dxa" w:w="60"/>
+              <w:right w:type="dxa" w:w="160"/>
+            </w:tcMar>
+          </w:tcPr>
+          <w:p>
+            <w:r>
+              <w:rPr>
+                <w:sz w:val="22"/>
+                <w:szCs w:val="22"/>
+              </w:rPr>
+              <w:t xml:space="preserve"/>
+            </w:r>
+          </w:p>
+        </w:tc>
+      </w:tr>
+      <w:tr>
+        <w:trPr>
+          <w:trHeight w:val="480"/>
+        </w:trPr>
+        <w:tc>
+          <w:tcPr>
+            <w:tcW w:type="dxa" w:w="9638"/>
+            <w:tcBorders>
+              <w:top w:val="single" w:color="E0E0E0" w:sz="4"/>
+              <w:left w:val="single" w:color="E0E0E0" w:sz="4"/>
+              <w:bottom w:val="single" w:color="E0E0E0" w:sz="4"/>
+              <w:right w:val="single" w:color="E0E0E0" w:sz="4"/>
+            </w:tcBorders>
+            <w:shd w:fill="FAFAFA" w:val="clear"/>
+            <w:tcMar>
+              <w:top w:type="dxa" w:w="60"/>
+              <w:left w:type="dxa" w:w="160"/>
+              <w:bottom w:type="dxa" w:w="60"/>
+              <w:right w:type="dxa" w:w="160"/>
+            </w:tcMar>
+          </w:tcPr>
+          <w:p>
+            <w:r>
+              <w:rPr>
+                <w:sz w:val="22"/>
+                <w:szCs w:val="22"/>
+              </w:rPr>
+              <w:t xml:space="preserve"/>
+            </w:r>
+          </w:p>
+        </w:tc>
+      </w:tr>
+      <w:tr>
+        <w:trPr>
+          <w:trHeight w:val="480"/>
+        </w:trPr>
+        <w:tc>
+          <w:tcPr>
+            <w:tcW w:type="dxa" w:w="9638"/>
+            <w:tcBorders>
+              <w:top w:val="single" w:color="E0E0E0" w:sz="4"/>
+              <w:left w:val="single" w:color="E0E0E0" w:sz="4"/>
+              <w:bottom w:val="single" w:color="E0E0E0" w:sz="4"/>
+              <w:right w:val="single" w:color="E0E0E0" w:sz="4"/>
+            </w:tcBorders>
+            <w:shd w:fill="FAFAFA" w:val="clear"/>
+            <w:tcMar>
+              <w:top w:type="dxa" w:w="60"/>
+              <w:left w:type="dxa" w:w="160"/>
+              <w:bottom w:type="dxa" w:w="60"/>
+              <w:right w:type="dxa" w:w="160"/>
             </w:tcMar>
           </w:tcPr>
           <w:p>

</xml_diff>